<commit_message>
Fix heading formatting in the code manual
Co-Authored-By: Claude Fable 5.1 <noreply@anthropic.com>
</commit_message>
<xml_diff>
--- a/docs/[OutdoorRMP]코드매뉴얼.docx
+++ b/docs/[OutdoorRMP]코드매뉴얼.docx
@@ -11452,7 +11452,7 @@
         <w:pStyle w:val="31"/>
       </w:pPr>
       <w:r>
-        <w:t xml:space="preserve">4.3.1 백본(`transnext_backbone.py`)</w:t>
+        <w:t xml:space="preserve">4.3.1 백본(transnext_backbone.py)</w:t>
       </w:r>
     </w:p>
     <w:tbl>
@@ -11745,7 +11745,7 @@
         <w:pStyle w:val="31"/>
       </w:pPr>
       <w:r>
-        <w:t xml:space="preserve">4.3.2 디코더(`emcad_decoder.py`)</w:t>
+        <w:t xml:space="preserve">4.3.2 디코더(emcad_decoder.py)</w:t>
       </w:r>
     </w:p>
     <w:tbl>

</xml_diff>